<commit_message>
Adiciona parecer de revisao juridica e aplica ajustes no termo e na politica
Termo v3: desfazimento com notificacao judicial ou por cartorio (DL 745/69),
separacao entre causas do comprador e causas alheias, prazo para financiar
apos o habite-se, LGPD com base em contrato e protecao do credito, ressalva
do arrependimento de 7 dias. Politica v3 com os mesmos cuidados e a ressalva
sobre a retencao de 50% em julgamento no STJ.

Co-Authored-By: Claude Opus 5.5 <noreply@anthropic.com>
Claude-Session: https://claude.ai/code/session_01Vke3PfuNi2WMa8Y1enPjwp
</commit_message>
<xml_diff>
--- a/politica-credito/Politica_de_Credito_MCMV.docx
+++ b/politica-credito/Politica_de_Credito_MCMV.docx
@@ -1409,7 +1409,7 @@
                 <w:sz w:val="18"/>
                 <w:szCs w:val="18"/>
               </w:rPr>
-              <w:t xml:space="preserve"> Reserva por 60 dias; assina só depois de quitar e nova análise Caixa.</w:t>
+              <w:t xml:space="preserve"> Reserva por 60 dias (sinal devolvido se o crédito não sair); assina só depois de quitar e nova análise Caixa.</w:t>
             </w:r>
           </w:p>
         </w:tc>
@@ -2795,7 +2795,7 @@
                 <w:sz w:val="17"/>
                 <w:szCs w:val="17"/>
               </w:rPr>
-              <w:t xml:space="preserve">Nas chaves: Caixa + saldo da entrada + acordos + empréstimos + cartão</w:t>
+              <w:t xml:space="preserve">Nas chaves: Caixa + entrada + acordos + empréstimos + cartão. Dívidas de banco acima de 6 rendas: só com comitê</w:t>
             </w:r>
           </w:p>
         </w:tc>
@@ -2805,21 +2805,6 @@
       <w:pPr>
         <w:spacing w:after="120"/>
       </w:pPr>
-    </w:p>
-    <w:p>
-      <w:pPr>
-        <w:spacing w:after="100" w:before="0" w:line="264"/>
-        <w:jc w:val="left"/>
-      </w:pPr>
-      <w:r>
-        <w:rPr>
-          <w:rFonts w:ascii="Arial" w:cs="Arial" w:eastAsia="Arial" w:hAnsi="Arial"/>
-          <w:color w:val="595959"/>
-          <w:sz w:val="17"/>
-          <w:szCs w:val="17"/>
-        </w:rPr>
-        <w:t xml:space="preserve">Dívidas de banco em dia somando mais de 6 vezes a renda: cliente alavancado demais, só com aprovação do comitê.</w:t>
-      </w:r>
     </w:p>
     <w:p>
       <w:pPr>
@@ -3208,7 +3193,27 @@
                 <w:sz w:val="18"/>
                 <w:szCs w:val="18"/>
               </w:rPr>
-              <w:t xml:space="preserve"> com as dívidas e o prazo de cada uma.</w:t>
+              <w:t xml:space="preserve"> com as dívidas e o prazo de cada uma. Entregar ao cliente o resultado da análise prévia. Assinado em estande ou fora da sede: respeitar os </w:t>
+            </w:r>
+            <w:r>
+              <w:rPr>
+                <w:rFonts w:ascii="Arial" w:cs="Arial" w:eastAsia="Arial" w:hAnsi="Arial"/>
+                <w:b/>
+                <w:bCs/>
+                <w:sz w:val="18"/>
+                <w:szCs w:val="18"/>
+              </w:rPr>
+              <w:t xml:space="preserve">7 dias de arrependimento</w:t>
+            </w:r>
+            <w:r>
+              <w:rPr>
+                <w:rFonts w:ascii="Arial" w:cs="Arial" w:eastAsia="Arial" w:hAnsi="Arial"/>
+                <w:b w:val="false"/>
+                <w:bCs w:val="false"/>
+                <w:sz w:val="18"/>
+                <w:szCs w:val="18"/>
+              </w:rPr>
+              <w:t xml:space="preserve">.</w:t>
             </w:r>
           </w:p>
         </w:tc>
@@ -3438,7 +3443,27 @@
                 <w:sz w:val="18"/>
                 <w:szCs w:val="18"/>
               </w:rPr>
-              <w:t xml:space="preserve"> e reunião → comitê decide.</w:t>
+              <w:t xml:space="preserve"> e reunião → comitê decide. Para desfazer o contrato: </w:t>
+            </w:r>
+            <w:r>
+              <w:rPr>
+                <w:rFonts w:ascii="Arial" w:cs="Arial" w:eastAsia="Arial" w:hAnsi="Arial"/>
+                <w:b/>
+                <w:bCs/>
+                <w:sz w:val="18"/>
+                <w:szCs w:val="18"/>
+              </w:rPr>
+              <w:t xml:space="preserve">notificação judicial ou por cartório (RTD) com 15 dias</w:t>
+            </w:r>
+            <w:r>
+              <w:rPr>
+                <w:rFonts w:ascii="Arial" w:cs="Arial" w:eastAsia="Arial" w:hAnsi="Arial"/>
+                <w:b w:val="false"/>
+                <w:bCs w:val="false"/>
+                <w:sz w:val="18"/>
+                <w:szCs w:val="18"/>
+              </w:rPr>
+              <w:t xml:space="preserve"> para regularizar.</w:t>
             </w:r>
           </w:p>
         </w:tc>
@@ -4097,7 +4122,7 @@
           <w:sz w:val="17"/>
           <w:szCs w:val="17"/>
         </w:rPr>
-        <w:t xml:space="preserve">Teto da carteira: no máximo 20% das unidades vendidas com Termo de Responsabilidade em aberto.</w:t>
+        <w:t xml:space="preserve">Teto da carteira: no máximo 20% das unidades vendidas com Termo em aberto. A classificação é apoio: a decisão é sempre de uma pessoa, e o cliente pode pedir revisão (LGPD, art. 20).</w:t>
       </w:r>
     </w:p>
     <w:p>
@@ -4117,7 +4142,7 @@
           <w:sz w:val="24"/>
           <w:szCs w:val="24"/>
         </w:rPr>
-        <w:t xml:space="preserve">8. Antes de adotar</w:t>
+        <w:t xml:space="preserve">8. Cuidados jurídicos</w:t>
       </w:r>
     </w:p>
     <w:p>
@@ -4136,7 +4161,7 @@
           <w:sz w:val="20"/>
           <w:szCs w:val="20"/>
         </w:rPr>
-        <w:t xml:space="preserve">Os valores em reais são ponto de partida: calibrar após os primeiros 50 repasses.</w:t>
+        <w:t xml:space="preserve">Valores em reais são ponto de partida: calibrar após 50 repasses.</w:t>
       </w:r>
     </w:p>
     <w:p>
@@ -4155,45 +4180,25 @@
           <w:sz w:val="20"/>
           <w:szCs w:val="20"/>
         </w:rPr>
-        <w:t xml:space="preserve">Confirmar com o correspondente Caixa o tratamento atual de prejuízo antigo e da restrição interna da Caixa.</w:t>
+        <w:t xml:space="preserve">Retenção no distrato: 25% sem afetação; até 50% com afetação, </w:t>
       </w:r>
-    </w:p>
-    <w:p>
-      <w:pPr>
-        <w:pStyle w:val="ListParagraph"/>
-        <w:numPr>
-          <w:ilvl w:val="0"/>
-          <w:numId w:val="2"/>
-        </w:numPr>
-        <w:spacing w:after="50" w:before="0" w:line="264"/>
-        <w:jc w:val="left"/>
-      </w:pPr>
+      <w:r>
+        <w:rPr>
+          <w:rFonts w:ascii="Arial" w:cs="Arial" w:eastAsia="Arial" w:hAnsi="Arial"/>
+          <w:b/>
+          <w:bCs/>
+          <w:sz w:val="20"/>
+          <w:szCs w:val="20"/>
+        </w:rPr>
+        <w:t xml:space="preserve">em julgamento no STJ</w:t>
+      </w:r>
       <w:r>
         <w:rPr>
           <w:rFonts w:ascii="Arial" w:cs="Arial" w:eastAsia="Arial" w:hAnsi="Arial"/>
           <w:sz w:val="20"/>
           <w:szCs w:val="20"/>
         </w:rPr>
-        <w:t xml:space="preserve">Revisão jurídica do contrato, do quadro-resumo (Lei 13.786/2018) e do Termo.</w:t>
-      </w:r>
-    </w:p>
-    <w:p>
-      <w:pPr>
-        <w:pStyle w:val="ListParagraph"/>
-        <w:numPr>
-          <w:ilvl w:val="0"/>
-          <w:numId w:val="2"/>
-        </w:numPr>
-        <w:spacing w:after="50" w:before="0" w:line="264"/>
-        <w:jc w:val="left"/>
-      </w:pPr>
-      <w:r>
-        <w:rPr>
-          <w:rFonts w:ascii="Arial" w:cs="Arial" w:eastAsia="Arial" w:hAnsi="Arial"/>
-          <w:sz w:val="20"/>
-          <w:szCs w:val="20"/>
-        </w:rPr>
-        <w:t xml:space="preserve">Definir patrimônio de afetação: permite reter até 50% no distrato por culpa do comprador (sem ele, 25%).</w:t>
+        <w:t xml:space="preserve"> (Temas 1.464 a 1.466) — projetar com 25%.</w:t>
       </w:r>
     </w:p>
     <w:sectPr>
@@ -4261,7 +4266,7 @@
         <w:sz w:val="15"/>
         <w:szCs w:val="15"/>
       </w:rPr>
-      <w:t xml:space="preserve">Política de Crédito MCMV · v2  ·  página </w:t>
+      <w:t xml:space="preserve">Política de Crédito MCMV · v3  ·  página </w:t>
     </w:r>
     <w:r>
       <w:rPr>

</xml_diff>